<commit_message>
feat(main): add files lab-7
</commit_message>
<xml_diff>
--- a/labs/lab05/report/Л05_Никта_отчёт.docx
+++ b/labs/lab05/report/Л05_Никта_отчёт.docx
@@ -59,19 +59,19 @@
         <w:pStyle w:val="Author"/>
       </w:pPr>
       <w:r>
-        <w:t xml:space="preserve">Незами</w:t>
+        <w:t xml:space="preserve">Хаджилари</w:t>
       </w:r>
       <w:r>
         <w:t xml:space="preserve"> </w:t>
       </w:r>
       <w:r>
-        <w:t xml:space="preserve">Ахмад</w:t>
+        <w:t xml:space="preserve">Гешлаг</w:t>
       </w:r>
       <w:r>
         <w:t xml:space="preserve"> </w:t>
       </w:r>
       <w:r>
-        <w:t xml:space="preserve">Белал</w:t>
+        <w:t xml:space="preserve">Никта</w:t>
       </w:r>
     </w:p>
     <w:sdt>

</xml_diff>